<commit_message>
umap tests (#31) (#32)
with embeddings without location ones
</commit_message>
<xml_diff>
--- a/_Clusterization/Sin_Locl/Investigadores y keywords/Pruebas clustering WE sin localizacion.docx
+++ b/_Clusterization/Sin_Locl/Investigadores y keywords/Pruebas clustering WE sin localizacion.docx
@@ -56,15 +56,7 @@
           <w:iCs/>
           <w:u w:val="single"/>
         </w:rPr>
-        <w:t>1</w:t>
-      </w:r>
-      <w:r>
-        <w:rPr>
-          <w:i/>
-          <w:iCs/>
-          <w:u w:val="single"/>
-        </w:rPr>
-        <w:t>4</w:t>
+        <w:t>14</w:t>
       </w:r>
     </w:p>
     <w:p>
@@ -242,12 +234,14 @@
         <w:rPr>
           <w:sz w:val="20"/>
           <w:szCs w:val="20"/>
-        </w:rPr>
-      </w:pPr>
-      <w:r>
-        <w:rPr>
-          <w:sz w:val="20"/>
-          <w:szCs w:val="20"/>
+          <w:lang w:val="en-GB"/>
+        </w:rPr>
+      </w:pPr>
+      <w:r>
+        <w:rPr>
+          <w:sz w:val="20"/>
+          <w:szCs w:val="20"/>
+          <w:lang w:val="en-GB"/>
         </w:rPr>
         <w:t>k=6 →</w:t>
       </w:r>
@@ -255,22 +249,9 @@
         <w:rPr>
           <w:sz w:val="20"/>
           <w:szCs w:val="20"/>
-        </w:rPr>
-        <w:t xml:space="preserve"> </w:t>
-      </w:r>
-      <w:r>
-        <w:rPr>
-          <w:sz w:val="20"/>
-          <w:szCs w:val="20"/>
-        </w:rPr>
-        <w:t>0.4</w:t>
-      </w:r>
-      <w:r>
-        <w:rPr>
-          <w:sz w:val="20"/>
-          <w:szCs w:val="20"/>
-        </w:rPr>
-        <w:t>07</w:t>
+          <w:lang w:val="en-GB"/>
+        </w:rPr>
+        <w:t xml:space="preserve"> 0.407</w:t>
       </w:r>
     </w:p>
     <w:p>
@@ -279,26 +260,22 @@
         <w:rPr>
           <w:sz w:val="20"/>
           <w:szCs w:val="20"/>
-        </w:rPr>
-      </w:pPr>
-      <w:r>
-        <w:rPr>
-          <w:sz w:val="20"/>
-          <w:szCs w:val="20"/>
-        </w:rPr>
-        <w:t>k=7 → 0.</w:t>
-      </w:r>
-      <w:r>
-        <w:rPr>
-          <w:sz w:val="20"/>
-          <w:szCs w:val="20"/>
-        </w:rPr>
-        <w:t>39</w:t>
-      </w:r>
-      <w:r>
-        <w:rPr>
-          <w:sz w:val="20"/>
-          <w:szCs w:val="20"/>
+          <w:lang w:val="en-GB"/>
+        </w:rPr>
+      </w:pPr>
+      <w:r>
+        <w:rPr>
+          <w:sz w:val="20"/>
+          <w:szCs w:val="20"/>
+          <w:lang w:val="en-GB"/>
+        </w:rPr>
+        <w:t>k=7 → 0.39</w:t>
+      </w:r>
+      <w:r>
+        <w:rPr>
+          <w:sz w:val="20"/>
+          <w:szCs w:val="20"/>
+          <w:lang w:val="en-GB"/>
         </w:rPr>
         <w:t>4</w:t>
       </w:r>
@@ -309,12 +286,14 @@
         <w:rPr>
           <w:sz w:val="20"/>
           <w:szCs w:val="20"/>
-        </w:rPr>
-      </w:pPr>
-      <w:r>
-        <w:rPr>
-          <w:sz w:val="20"/>
-          <w:szCs w:val="20"/>
+          <w:lang w:val="en-GB"/>
+        </w:rPr>
+      </w:pPr>
+      <w:r>
+        <w:rPr>
+          <w:sz w:val="20"/>
+          <w:szCs w:val="20"/>
+          <w:lang w:val="en-GB"/>
         </w:rPr>
         <w:t>k=8 → 0.</w:t>
       </w:r>
@@ -322,6 +301,7 @@
         <w:rPr>
           <w:sz w:val="20"/>
           <w:szCs w:val="20"/>
+          <w:lang w:val="en-GB"/>
         </w:rPr>
         <w:t>386</w:t>
       </w:r>
@@ -332,29 +312,51 @@
         <w:rPr>
           <w:sz w:val="20"/>
           <w:szCs w:val="20"/>
-        </w:rPr>
-      </w:pPr>
-      <w:r>
-        <w:rPr>
-          <w:sz w:val="20"/>
-          <w:szCs w:val="20"/>
-        </w:rPr>
-        <w:t>k=9 → 0.</w:t>
-      </w:r>
-      <w:r>
-        <w:rPr>
-          <w:sz w:val="20"/>
-          <w:szCs w:val="20"/>
+          <w:lang w:val="en-GB"/>
+        </w:rPr>
+      </w:pPr>
+      <w:r>
+        <w:rPr>
+          <w:sz w:val="20"/>
+          <w:szCs w:val="20"/>
+          <w:lang w:val="en-GB"/>
+        </w:rPr>
+        <w:t>k=9 → 0.3</w:t>
+      </w:r>
+      <w:r>
+        <w:rPr>
+          <w:sz w:val="20"/>
+          <w:szCs w:val="20"/>
+          <w:lang w:val="en-GB"/>
+        </w:rPr>
+        <w:t>77</w:t>
+      </w:r>
+    </w:p>
+    <w:p>
+      <w:pPr>
+        <w:spacing w:after="0"/>
+        <w:rPr>
+          <w:sz w:val="20"/>
+          <w:szCs w:val="20"/>
+          <w:lang w:val="en-GB"/>
+        </w:rPr>
+      </w:pPr>
+      <w:r>
+        <w:rPr>
+          <w:sz w:val="20"/>
+          <w:szCs w:val="20"/>
+          <w:lang w:val="en-GB"/>
+        </w:rPr>
+        <w:t>k=10 → 0.</w:t>
+      </w:r>
+      <w:r>
+        <w:rPr>
+          <w:sz w:val="20"/>
+          <w:szCs w:val="20"/>
+          <w:lang w:val="en-GB"/>
         </w:rPr>
         <w:t>3</w:t>
       </w:r>
-      <w:r>
-        <w:rPr>
-          <w:sz w:val="20"/>
-          <w:szCs w:val="20"/>
-        </w:rPr>
-        <w:t>77</w:t>
-      </w:r>
     </w:p>
     <w:p>
       <w:pPr>
@@ -362,36 +364,7 @@
         <w:rPr>
           <w:sz w:val="20"/>
           <w:szCs w:val="20"/>
-        </w:rPr>
-      </w:pPr>
-      <w:r>
-        <w:rPr>
-          <w:sz w:val="20"/>
-          <w:szCs w:val="20"/>
-        </w:rPr>
-        <w:t>k=10 → 0</w:t>
-      </w:r>
-      <w:r>
-        <w:rPr>
-          <w:sz w:val="20"/>
-          <w:szCs w:val="20"/>
-        </w:rPr>
-        <w:t>.</w:t>
-      </w:r>
-      <w:r>
-        <w:rPr>
-          <w:sz w:val="20"/>
-          <w:szCs w:val="20"/>
-        </w:rPr>
-        <w:t>3</w:t>
-      </w:r>
-    </w:p>
-    <w:p>
-      <w:pPr>
-        <w:spacing w:after="0"/>
-        <w:rPr>
-          <w:sz w:val="20"/>
-          <w:szCs w:val="20"/>
+          <w:lang w:val="en-GB"/>
         </w:rPr>
       </w:pPr>
     </w:p>
@@ -1649,14 +1622,7 @@
           <w:sz w:val="20"/>
           <w:szCs w:val="20"/>
         </w:rPr>
-        <w:t>k=6 → 0.</w:t>
-      </w:r>
-      <w:r>
-        <w:rPr>
-          <w:sz w:val="20"/>
-          <w:szCs w:val="20"/>
-        </w:rPr>
-        <w:t>552</w:t>
+        <w:t>k=6 → 0.552</w:t>
       </w:r>
       <w:r>
         <w:rPr>
@@ -1686,14 +1652,7 @@
           <w:sz w:val="20"/>
           <w:szCs w:val="20"/>
         </w:rPr>
-        <w:t>k=7 → 0.</w:t>
-      </w:r>
-      <w:r>
-        <w:rPr>
-          <w:sz w:val="20"/>
-          <w:szCs w:val="20"/>
-        </w:rPr>
-        <w:t>5</w:t>
+        <w:t>k=7 → 0.5</w:t>
       </w:r>
       <w:r>
         <w:rPr>
@@ -1739,14 +1698,7 @@
           <w:sz w:val="20"/>
           <w:szCs w:val="20"/>
         </w:rPr>
-        <w:t>k=9 → 0.</w:t>
-      </w:r>
-      <w:r>
-        <w:rPr>
-          <w:sz w:val="20"/>
-          <w:szCs w:val="20"/>
-        </w:rPr>
-        <w:t>465</w:t>
+        <w:t>k=9 → 0.465</w:t>
       </w:r>
     </w:p>
     <w:p>
@@ -1781,42 +1733,16 @@
         <w:rPr>
           <w:sz w:val="20"/>
           <w:szCs w:val="20"/>
-        </w:rPr>
-      </w:pPr>
-      <w:r>
-        <w:rPr>
-          <w:sz w:val="20"/>
-          <w:szCs w:val="20"/>
-        </w:rPr>
-        <w:t>k=</w:t>
-      </w:r>
-      <w:r>
-        <w:rPr>
-          <w:sz w:val="20"/>
-          <w:szCs w:val="20"/>
-        </w:rPr>
-        <w:t>11</w:t>
-      </w:r>
-      <w:r>
-        <w:rPr>
-          <w:sz w:val="20"/>
-          <w:szCs w:val="20"/>
-        </w:rPr>
-        <w:t xml:space="preserve"> → 0.</w:t>
-      </w:r>
-      <w:r>
-        <w:rPr>
-          <w:sz w:val="20"/>
-          <w:szCs w:val="20"/>
-        </w:rPr>
-        <w:t>5</w:t>
-      </w:r>
-      <w:r>
-        <w:rPr>
-          <w:sz w:val="20"/>
-          <w:szCs w:val="20"/>
-        </w:rPr>
-        <w:t>3</w:t>
+          <w:lang w:val="en-GB"/>
+        </w:rPr>
+      </w:pPr>
+      <w:r>
+        <w:rPr>
+          <w:sz w:val="20"/>
+          <w:szCs w:val="20"/>
+          <w:lang w:val="en-GB"/>
+        </w:rPr>
+        <w:t>k=11 → 0.53</w:t>
       </w:r>
     </w:p>
     <w:p>
@@ -1825,42 +1751,16 @@
         <w:rPr>
           <w:sz w:val="20"/>
           <w:szCs w:val="20"/>
-        </w:rPr>
-      </w:pPr>
-      <w:r>
-        <w:rPr>
-          <w:sz w:val="20"/>
-          <w:szCs w:val="20"/>
-        </w:rPr>
-        <w:t>k=</w:t>
-      </w:r>
-      <w:r>
-        <w:rPr>
-          <w:sz w:val="20"/>
-          <w:szCs w:val="20"/>
-        </w:rPr>
-        <w:t>12</w:t>
-      </w:r>
-      <w:r>
-        <w:rPr>
-          <w:sz w:val="20"/>
-          <w:szCs w:val="20"/>
-        </w:rPr>
-        <w:t xml:space="preserve"> → 0.</w:t>
-      </w:r>
-      <w:r>
-        <w:rPr>
-          <w:sz w:val="20"/>
-          <w:szCs w:val="20"/>
-        </w:rPr>
-        <w:t>5</w:t>
-      </w:r>
-      <w:r>
-        <w:rPr>
-          <w:sz w:val="20"/>
-          <w:szCs w:val="20"/>
-        </w:rPr>
-        <w:t>29</w:t>
+          <w:lang w:val="en-GB"/>
+        </w:rPr>
+      </w:pPr>
+      <w:r>
+        <w:rPr>
+          <w:sz w:val="20"/>
+          <w:szCs w:val="20"/>
+          <w:lang w:val="en-GB"/>
+        </w:rPr>
+        <w:t>k=12 → 0.529</w:t>
       </w:r>
     </w:p>
     <w:p>
@@ -2412,14 +2312,7 @@
           <w:sz w:val="20"/>
           <w:szCs w:val="20"/>
         </w:rPr>
-        <w:t>52</w:t>
-      </w:r>
-      <w:r>
-        <w:rPr>
-          <w:sz w:val="20"/>
-          <w:szCs w:val="20"/>
-        </w:rPr>
-        <w:t>5</w:t>
+        <w:t>525</w:t>
       </w:r>
     </w:p>
     <w:p>
@@ -2449,14 +2342,7 @@
           <w:sz w:val="20"/>
           <w:szCs w:val="20"/>
         </w:rPr>
-        <w:t>5</w:t>
-      </w:r>
-      <w:r>
-        <w:rPr>
-          <w:sz w:val="20"/>
-          <w:szCs w:val="20"/>
-        </w:rPr>
-        <w:t>10</w:t>
+        <w:t>510</w:t>
       </w:r>
     </w:p>
     <w:p>
@@ -2578,14 +2464,7 @@
           <w:sz w:val="20"/>
           <w:szCs w:val="20"/>
         </w:rPr>
-        <w:t>k=11 → 0.5</w:t>
-      </w:r>
-      <w:r>
-        <w:rPr>
-          <w:sz w:val="20"/>
-          <w:szCs w:val="20"/>
-        </w:rPr>
-        <w:t>24</w:t>
+        <w:t>k=11 → 0.524</w:t>
       </w:r>
     </w:p>
     <w:p>
@@ -2614,9 +2493,6 @@
     <w:p>
       <w:pPr>
         <w:spacing w:after="0"/>
-        <w:rPr>
-          <w:lang w:val="en-GB"/>
-        </w:rPr>
       </w:pPr>
     </w:p>
     <w:p>
@@ -3592,14 +3468,8 @@
       <w:pPr>
         <w:spacing w:after="0"/>
         <w:jc w:val="both"/>
-        <w:rPr>
-          <w:lang w:val="en-GB"/>
-        </w:rPr>
-      </w:pPr>
-      <w:r>
-        <w:rPr>
-          <w:lang w:val="en-GB"/>
-        </w:rPr>
+      </w:pPr>
+      <w:r>
         <w:t>Sin PCA</w:t>
       </w:r>
     </w:p>
@@ -3909,20 +3779,16 @@
     <w:p>
       <w:pPr>
         <w:jc w:val="center"/>
-        <w:rPr>
-          <w:lang w:val="en-GB"/>
-        </w:rPr>
       </w:pPr>
       <w:r>
         <w:rPr>
           <w:noProof/>
-          <w:lang w:val="en-GB"/>
         </w:rPr>
         <w:drawing>
-          <wp:inline distT="0" distB="0" distL="0" distR="0" wp14:anchorId="70A6ECE6" wp14:editId="43F6F7E1">
-            <wp:extent cx="4762500" cy="2464278"/>
-            <wp:effectExtent l="0" t="0" r="0" b="0"/>
-            <wp:docPr id="1660284507" name="Imagen 2" descr="Gráfico, Gráfico de dispersión&#10;&#10;El contenido generado por IA puede ser incorrecto."/>
+          <wp:inline distT="0" distB="0" distL="0" distR="0" wp14:anchorId="0DAA47E2" wp14:editId="78A76C12">
+            <wp:extent cx="5461173" cy="2400300"/>
+            <wp:effectExtent l="0" t="0" r="6350" b="0"/>
+            <wp:docPr id="1171078656" name="Imagen 1"/>
             <wp:cNvGraphicFramePr>
               <a:graphicFrameLocks xmlns:a="http://schemas.openxmlformats.org/drawingml/2006/main" noChangeAspect="1"/>
             </wp:cNvGraphicFramePr>
@@ -3930,7 +3796,7 @@
               <a:graphicData uri="http://schemas.openxmlformats.org/drawingml/2006/picture">
                 <pic:pic xmlns:pic="http://schemas.openxmlformats.org/drawingml/2006/picture">
                   <pic:nvPicPr>
-                    <pic:cNvPr id="1660284507" name="Imagen 2" descr="Gráfico, Gráfico de dispersión&#10;&#10;El contenido generado por IA puede ser incorrecto."/>
+                    <pic:cNvPr id="0" name="Picture 2"/>
                     <pic:cNvPicPr>
                       <a:picLocks noChangeAspect="1" noChangeArrowheads="1"/>
                     </pic:cNvPicPr>
@@ -3951,7 +3817,7 @@
                   <pic:spPr bwMode="auto">
                     <a:xfrm>
                       <a:off x="0" y="0"/>
-                      <a:ext cx="4769320" cy="2467807"/>
+                      <a:ext cx="5470404" cy="2404357"/>
                     </a:xfrm>
                     <a:prstGeom prst="rect">
                       <a:avLst/>
@@ -3966,21 +3832,16 @@
       </w:r>
     </w:p>
     <w:p>
-      <w:r>
-        <w:t>L</w:t>
-      </w:r>
-      <w:r>
-        <w:t>ogra tres grupos bien diferenciados, reflejando una separación temática clara y coherente entre los investigadores.</w:t>
-      </w:r>
-    </w:p>
-    <w:p>
       <w:proofErr w:type="spellStart"/>
       <w:r>
         <w:t>Silhouette</w:t>
       </w:r>
       <w:proofErr w:type="spellEnd"/>
       <w:r>
-        <w:t xml:space="preserve"> = 0.602</w:t>
+        <w:t xml:space="preserve"> = </w:t>
+      </w:r>
+      <w:r>
+        <w:t>0.627</w:t>
       </w:r>
     </w:p>
     <w:p>
@@ -3992,10 +3853,10 @@
           <w:noProof/>
         </w:rPr>
         <w:drawing>
-          <wp:inline distT="0" distB="0" distL="0" distR="0" wp14:anchorId="4B323895" wp14:editId="01587071">
-            <wp:extent cx="4410075" cy="2281922"/>
-            <wp:effectExtent l="0" t="0" r="0" b="4445"/>
-            <wp:docPr id="1300466916" name="Imagen 3" descr="Gráfico, Histograma&#10;&#10;El contenido generado por IA puede ser incorrecto."/>
+          <wp:inline distT="0" distB="0" distL="0" distR="0" wp14:anchorId="7E45F179" wp14:editId="3B17A170">
+            <wp:extent cx="5526188" cy="2428875"/>
+            <wp:effectExtent l="0" t="0" r="0" b="0"/>
+            <wp:docPr id="517646743" name="Imagen 2"/>
             <wp:cNvGraphicFramePr>
               <a:graphicFrameLocks xmlns:a="http://schemas.openxmlformats.org/drawingml/2006/main" noChangeAspect="1"/>
             </wp:cNvGraphicFramePr>
@@ -4003,7 +3864,7 @@
               <a:graphicData uri="http://schemas.openxmlformats.org/drawingml/2006/picture">
                 <pic:pic xmlns:pic="http://schemas.openxmlformats.org/drawingml/2006/picture">
                   <pic:nvPicPr>
-                    <pic:cNvPr id="1300466916" name="Imagen 3" descr="Gráfico, Histograma&#10;&#10;El contenido generado por IA puede ser incorrecto."/>
+                    <pic:cNvPr id="0" name="Picture 3"/>
                     <pic:cNvPicPr>
                       <a:picLocks noChangeAspect="1" noChangeArrowheads="1"/>
                     </pic:cNvPicPr>
@@ -4024,7 +3885,7 @@
                   <pic:spPr bwMode="auto">
                     <a:xfrm>
                       <a:off x="0" y="0"/>
-                      <a:ext cx="4418673" cy="2286371"/>
+                      <a:ext cx="5551103" cy="2439826"/>
                     </a:xfrm>
                     <a:prstGeom prst="rect">
                       <a:avLst/>
@@ -4072,16 +3933,18 @@
     <w:p>
       <w:pPr>
         <w:jc w:val="center"/>
-      </w:pPr>
-      <w:r>
-        <w:rPr>
-          <w:noProof/>
-        </w:rPr>
+        <w:rPr>
+          <w:i/>
+          <w:iCs/>
+          <w:u w:val="single"/>
+        </w:rPr>
+      </w:pPr>
+      <w:r>
         <w:drawing>
-          <wp:inline distT="0" distB="0" distL="0" distR="0" wp14:anchorId="144AF9D5" wp14:editId="1B5F0DA3">
-            <wp:extent cx="3371850" cy="4922617"/>
+          <wp:inline distT="0" distB="0" distL="0" distR="0" wp14:anchorId="1A3E96B2" wp14:editId="62785824">
+            <wp:extent cx="4884974" cy="5895975"/>
             <wp:effectExtent l="0" t="0" r="0" b="0"/>
-            <wp:docPr id="392601041" name="Imagen 1" descr="Tabla&#10;&#10;El contenido generado por IA puede ser incorrecto."/>
+            <wp:docPr id="749412811" name="Imagen 1" descr="Tabla&#10;&#10;El contenido generado por IA puede ser incorrecto."/>
             <wp:cNvGraphicFramePr>
               <a:graphicFrameLocks xmlns:a="http://schemas.openxmlformats.org/drawingml/2006/main" noChangeAspect="1"/>
             </wp:cNvGraphicFramePr>
@@ -4089,7 +3952,7 @@
               <a:graphicData uri="http://schemas.openxmlformats.org/drawingml/2006/picture">
                 <pic:pic xmlns:pic="http://schemas.openxmlformats.org/drawingml/2006/picture">
                   <pic:nvPicPr>
-                    <pic:cNvPr id="392601041" name="Imagen 1" descr="Tabla&#10;&#10;El contenido generado por IA puede ser incorrecto."/>
+                    <pic:cNvPr id="749412811" name="Imagen 1" descr="Tabla&#10;&#10;El contenido generado por IA puede ser incorrecto."/>
                     <pic:cNvPicPr/>
                   </pic:nvPicPr>
                   <pic:blipFill>
@@ -4101,7 +3964,7 @@
                   <pic:spPr>
                     <a:xfrm>
                       <a:off x="0" y="0"/>
-                      <a:ext cx="3381974" cy="4937397"/>
+                      <a:ext cx="4890785" cy="5902988"/>
                     </a:xfrm>
                     <a:prstGeom prst="rect">
                       <a:avLst/>
@@ -4114,14 +3977,31 @@
         </w:drawing>
       </w:r>
       <w:r>
+        <w:br w:type="page"/>
+      </w:r>
+    </w:p>
+    <w:p>
+      <w:pPr>
+        <w:jc w:val="both"/>
+      </w:pPr>
+      <w:r>
+        <w:lastRenderedPageBreak/>
+        <w:t>Con k=4</w:t>
+      </w:r>
+    </w:p>
+    <w:p>
+      <w:pPr>
+        <w:jc w:val="both"/>
+      </w:pPr>
+      <w:r>
         <w:rPr>
           <w:noProof/>
         </w:rPr>
         <w:drawing>
-          <wp:inline distT="0" distB="0" distL="0" distR="0" wp14:anchorId="289AF4F7" wp14:editId="5BB47DE6">
-            <wp:extent cx="1305622" cy="4933950"/>
-            <wp:effectExtent l="0" t="0" r="8890" b="0"/>
-            <wp:docPr id="178705677" name="Imagen 1" descr="Imagen que contiene Tabla&#10;&#10;El contenido generado por IA puede ser incorrecto."/>
+          <wp:inline distT="0" distB="0" distL="0" distR="0" wp14:anchorId="1F7694BE" wp14:editId="6AB417EA">
+            <wp:extent cx="5391150" cy="2597555"/>
+            <wp:effectExtent l="0" t="0" r="0" b="0"/>
+            <wp:docPr id="1317085532" name="Imagen 4" descr="Gráfico, Gráfico de dispersión&#10;&#10;El contenido generado por IA puede ser incorrecto."/>
             <wp:cNvGraphicFramePr>
               <a:graphicFrameLocks xmlns:a="http://schemas.openxmlformats.org/drawingml/2006/main" noChangeAspect="1"/>
             </wp:cNvGraphicFramePr>
@@ -4129,23 +4009,33 @@
               <a:graphicData uri="http://schemas.openxmlformats.org/drawingml/2006/picture">
                 <pic:pic xmlns:pic="http://schemas.openxmlformats.org/drawingml/2006/picture">
                   <pic:nvPicPr>
-                    <pic:cNvPr id="178705677" name="Imagen 1" descr="Imagen que contiene Tabla&#10;&#10;El contenido generado por IA puede ser incorrecto."/>
-                    <pic:cNvPicPr/>
+                    <pic:cNvPr id="1317085532" name="Imagen 4" descr="Gráfico, Gráfico de dispersión&#10;&#10;El contenido generado por IA puede ser incorrecto."/>
+                    <pic:cNvPicPr>
+                      <a:picLocks noChangeAspect="1" noChangeArrowheads="1"/>
+                    </pic:cNvPicPr>
                   </pic:nvPicPr>
                   <pic:blipFill>
-                    <a:blip r:embed="rId24"/>
+                    <a:blip r:embed="rId24">
+                      <a:extLst>
+                        <a:ext uri="{28A0092B-C50C-407E-A947-70E740481C1C}">
+                          <a14:useLocalDpi xmlns:a14="http://schemas.microsoft.com/office/drawing/2010/main" val="0"/>
+                        </a:ext>
+                      </a:extLst>
+                    </a:blip>
+                    <a:srcRect/>
                     <a:stretch>
                       <a:fillRect/>
                     </a:stretch>
                   </pic:blipFill>
-                  <pic:spPr>
+                  <pic:spPr bwMode="auto">
                     <a:xfrm>
                       <a:off x="0" y="0"/>
-                      <a:ext cx="1309037" cy="4946856"/>
+                      <a:ext cx="5409712" cy="2606498"/>
                     </a:xfrm>
                     <a:prstGeom prst="rect">
                       <a:avLst/>
                     </a:prstGeom>
+                    <a:noFill/>
                   </pic:spPr>
                 </pic:pic>
               </a:graphicData>
@@ -4155,47 +4045,16 @@
       </w:r>
     </w:p>
     <w:p>
-      <w:pPr>
-        <w:jc w:val="both"/>
-      </w:pPr>
-      <w:r>
-        <w:t xml:space="preserve">Los resultados obtenidos muestran un valor medio de </w:t>
-      </w:r>
-      <w:proofErr w:type="spellStart"/>
-      <w:r>
-        <w:rPr>
-          <w:i/>
-          <w:iCs/>
-        </w:rPr>
-        <w:t>silhouette</w:t>
-      </w:r>
-      <w:proofErr w:type="spellEnd"/>
-      <w:r>
-        <w:t xml:space="preserve"> de 0,6, lo que indica una buena calidad de agrupamiento y una clara separación entre los grupos. El modelo ha identificado tres </w:t>
-      </w:r>
-      <w:proofErr w:type="spellStart"/>
-      <w:proofErr w:type="gramStart"/>
-      <w:r>
-        <w:t>clusters</w:t>
-      </w:r>
-      <w:proofErr w:type="spellEnd"/>
-      <w:proofErr w:type="gramEnd"/>
-      <w:r>
-        <w:t xml:space="preserve"> principales que reflejan diferencias temáticas entre los investigadores, con la mayoría de ellos bien integrados en su respectivo grupo. Las coordenadas UMAP1 y UMAP2 representan la posición de cada investigador en el espacio reducido y permiten visualizar esta estructura de forma intuitiva.</w:t>
-      </w:r>
-    </w:p>
-    <w:p>
-      <w:r>
-        <w:br w:type="page"/>
-      </w:r>
-    </w:p>
-    <w:p>
-      <w:pPr>
-        <w:jc w:val="both"/>
-      </w:pPr>
-      <w:r>
-        <w:lastRenderedPageBreak/>
-        <w:t>Con k=4</w:t>
+      <w:proofErr w:type="spellStart"/>
+      <w:r>
+        <w:t>Silhouette</w:t>
+      </w:r>
+      <w:proofErr w:type="spellEnd"/>
+      <w:r>
+        <w:t xml:space="preserve"> = </w:t>
+      </w:r>
+      <w:r>
+        <w:t>0.596</w:t>
       </w:r>
     </w:p>
     <w:p>
@@ -4207,10 +4066,10 @@
           <w:noProof/>
         </w:rPr>
         <w:drawing>
-          <wp:inline distT="0" distB="0" distL="0" distR="0" wp14:anchorId="364EB60C" wp14:editId="38DE51DA">
-            <wp:extent cx="4305300" cy="2227708"/>
-            <wp:effectExtent l="0" t="0" r="0" b="1270"/>
-            <wp:docPr id="1476266916" name="Imagen 5" descr="Gráfico, Histograma&#10;&#10;El contenido generado por IA puede ser incorrecto."/>
+          <wp:inline distT="0" distB="0" distL="0" distR="0" wp14:anchorId="0DC9C742" wp14:editId="15AFB9C5">
+            <wp:extent cx="5298055" cy="2552700"/>
+            <wp:effectExtent l="0" t="0" r="0" b="0"/>
+            <wp:docPr id="1666732743" name="Imagen 3"/>
             <wp:cNvGraphicFramePr>
               <a:graphicFrameLocks xmlns:a="http://schemas.openxmlformats.org/drawingml/2006/main" noChangeAspect="1"/>
             </wp:cNvGraphicFramePr>
@@ -4218,7 +4077,7 @@
               <a:graphicData uri="http://schemas.openxmlformats.org/drawingml/2006/picture">
                 <pic:pic xmlns:pic="http://schemas.openxmlformats.org/drawingml/2006/picture">
                   <pic:nvPicPr>
-                    <pic:cNvPr id="1476266916" name="Imagen 5" descr="Gráfico, Histograma&#10;&#10;El contenido generado por IA puede ser incorrecto."/>
+                    <pic:cNvPr id="0" name="Picture 4"/>
                     <pic:cNvPicPr>
                       <a:picLocks noChangeAspect="1" noChangeArrowheads="1"/>
                     </pic:cNvPicPr>
@@ -4239,7 +4098,7 @@
                   <pic:spPr bwMode="auto">
                     <a:xfrm>
                       <a:off x="0" y="0"/>
-                      <a:ext cx="4311748" cy="2231044"/>
+                      <a:ext cx="5312816" cy="2559812"/>
                     </a:xfrm>
                     <a:prstGeom prst="rect">
                       <a:avLst/>
@@ -4257,15 +4116,61 @@
       <w:pPr>
         <w:jc w:val="center"/>
       </w:pPr>
-      <w:r>
-        <w:rPr>
-          <w:noProof/>
-        </w:rPr>
+    </w:p>
+    <w:p>
+      <w:pPr>
+        <w:jc w:val="center"/>
+      </w:pPr>
+    </w:p>
+    <w:p>
+      <w:pPr>
+        <w:jc w:val="center"/>
+      </w:pPr>
+      <w:r>
+        <w:br w:type="page"/>
+      </w:r>
+    </w:p>
+    <w:p>
+      <w:pPr>
+        <w:rPr>
+          <w:i/>
+          <w:iCs/>
+          <w:u w:val="single"/>
+        </w:rPr>
+      </w:pPr>
+      <w:r>
+        <w:rPr>
+          <w:i/>
+          <w:iCs/>
+          <w:u w:val="single"/>
+        </w:rPr>
+        <w:lastRenderedPageBreak/>
+        <w:t>Resultado</w:t>
+      </w:r>
+      <w:r>
+        <w:rPr>
+          <w:i/>
+          <w:iCs/>
+          <w:u w:val="single"/>
+        </w:rPr>
+        <w:t xml:space="preserve"> de cada investigador</w:t>
+      </w:r>
+    </w:p>
+    <w:p>
+      <w:pPr>
+        <w:jc w:val="center"/>
+        <w:rPr>
+          <w:i/>
+          <w:iCs/>
+          <w:u w:val="single"/>
+        </w:rPr>
+      </w:pPr>
+      <w:r>
         <w:drawing>
-          <wp:inline distT="0" distB="0" distL="0" distR="0" wp14:anchorId="27A87985" wp14:editId="054A9BD1">
-            <wp:extent cx="3187979" cy="4923655"/>
-            <wp:effectExtent l="0" t="0" r="0" b="0"/>
-            <wp:docPr id="1604114821" name="Imagen 1" descr="Tabla&#10;&#10;El contenido generado por IA puede ser incorrecto."/>
+          <wp:inline distT="0" distB="0" distL="0" distR="0" wp14:anchorId="2A8B7EF2" wp14:editId="33B814EF">
+            <wp:extent cx="4599940" cy="5535723"/>
+            <wp:effectExtent l="0" t="0" r="0" b="8255"/>
+            <wp:docPr id="643987551" name="Imagen 1" descr="Tabla&#10;&#10;El contenido generado por IA puede ser incorrecto."/>
             <wp:cNvGraphicFramePr>
               <a:graphicFrameLocks xmlns:a="http://schemas.openxmlformats.org/drawingml/2006/main" noChangeAspect="1"/>
             </wp:cNvGraphicFramePr>
@@ -4273,7 +4178,7 @@
               <a:graphicData uri="http://schemas.openxmlformats.org/drawingml/2006/picture">
                 <pic:pic xmlns:pic="http://schemas.openxmlformats.org/drawingml/2006/picture">
                   <pic:nvPicPr>
-                    <pic:cNvPr id="1604114821" name="Imagen 1" descr="Tabla&#10;&#10;El contenido generado por IA puede ser incorrecto."/>
+                    <pic:cNvPr id="643987551" name="Imagen 1" descr="Tabla&#10;&#10;El contenido generado por IA puede ser incorrecto."/>
                     <pic:cNvPicPr/>
                   </pic:nvPicPr>
                   <pic:blipFill>
@@ -4285,7 +4190,7 @@
                   <pic:spPr>
                     <a:xfrm>
                       <a:off x="0" y="0"/>
-                      <a:ext cx="3192711" cy="4930963"/>
+                      <a:ext cx="4604944" cy="5541745"/>
                     </a:xfrm>
                     <a:prstGeom prst="rect">
                       <a:avLst/>
@@ -4299,13 +4204,82 @@
       </w:r>
       <w:r>
         <w:rPr>
+          <w:i/>
+          <w:iCs/>
+          <w:u w:val="single"/>
+        </w:rPr>
+        <w:br w:type="page"/>
+      </w:r>
+    </w:p>
+    <w:p>
+      <w:pPr>
+        <w:rPr>
+          <w:i/>
+          <w:iCs/>
+          <w:u w:val="single"/>
+        </w:rPr>
+      </w:pPr>
+      <w:r>
+        <w:rPr>
+          <w:i/>
+          <w:iCs/>
+          <w:u w:val="single"/>
+        </w:rPr>
+        <w:lastRenderedPageBreak/>
+        <w:t xml:space="preserve">UMAP </w:t>
+      </w:r>
+      <w:r>
+        <w:rPr>
+          <w:i/>
+          <w:iCs/>
+          <w:u w:val="single"/>
+          <w:lang w:val="en-GB"/>
+        </w:rPr>
+        <w:sym w:font="Wingdings" w:char="F0E0"/>
+      </w:r>
+      <w:r>
+        <w:rPr>
+          <w:i/>
+          <w:iCs/>
+          <w:u w:val="single"/>
+        </w:rPr>
+        <w:t xml:space="preserve"> </w:t>
+      </w:r>
+      <w:r>
+        <w:rPr>
+          <w:i/>
+          <w:iCs/>
+          <w:u w:val="single"/>
+        </w:rPr>
+        <w:t>Manhattan</w:t>
+      </w:r>
+      <w:r>
+        <w:rPr>
+          <w:i/>
+          <w:iCs/>
+          <w:u w:val="single"/>
+        </w:rPr>
+        <w:t xml:space="preserve"> + Jerárquico</w:t>
+      </w:r>
+    </w:p>
+    <w:p>
+      <w:pPr>
+        <w:jc w:val="center"/>
+        <w:rPr>
+          <w:i/>
+          <w:iCs/>
+          <w:u w:val="single"/>
+        </w:rPr>
+      </w:pPr>
+      <w:r>
+        <w:rPr>
           <w:noProof/>
         </w:rPr>
         <w:drawing>
-          <wp:inline distT="0" distB="0" distL="0" distR="0" wp14:anchorId="1A4852C1" wp14:editId="639B87EF">
-            <wp:extent cx="1305622" cy="4933950"/>
-            <wp:effectExtent l="0" t="0" r="8890" b="0"/>
-            <wp:docPr id="1233685386" name="Imagen 1" descr="Imagen que contiene Tabla&#10;&#10;El contenido generado por IA puede ser incorrecto."/>
+          <wp:inline distT="0" distB="0" distL="0" distR="0" wp14:anchorId="4063E360" wp14:editId="1FC2CFCE">
+            <wp:extent cx="5357365" cy="2581275"/>
+            <wp:effectExtent l="0" t="0" r="0" b="0"/>
+            <wp:docPr id="2075926849" name="Imagen 6" descr="Gráfico, Gráfico de dispersión&#10;&#10;El contenido generado por IA puede ser incorrecto."/>
             <wp:cNvGraphicFramePr>
               <a:graphicFrameLocks xmlns:a="http://schemas.openxmlformats.org/drawingml/2006/main" noChangeAspect="1"/>
             </wp:cNvGraphicFramePr>
@@ -4313,53 +4287,7 @@
               <a:graphicData uri="http://schemas.openxmlformats.org/drawingml/2006/picture">
                 <pic:pic xmlns:pic="http://schemas.openxmlformats.org/drawingml/2006/picture">
                   <pic:nvPicPr>
-                    <pic:cNvPr id="178705677" name="Imagen 1" descr="Imagen que contiene Tabla&#10;&#10;El contenido generado por IA puede ser incorrecto."/>
-                    <pic:cNvPicPr/>
-                  </pic:nvPicPr>
-                  <pic:blipFill>
-                    <a:blip r:embed="rId24"/>
-                    <a:stretch>
-                      <a:fillRect/>
-                    </a:stretch>
-                  </pic:blipFill>
-                  <pic:spPr>
-                    <a:xfrm>
-                      <a:off x="0" y="0"/>
-                      <a:ext cx="1309037" cy="4946856"/>
-                    </a:xfrm>
-                    <a:prstGeom prst="rect">
-                      <a:avLst/>
-                    </a:prstGeom>
-                  </pic:spPr>
-                </pic:pic>
-              </a:graphicData>
-            </a:graphic>
-          </wp:inline>
-        </w:drawing>
-      </w:r>
-    </w:p>
-    <w:p>
-      <w:pPr>
-        <w:jc w:val="center"/>
-      </w:pPr>
-      <w:r>
-        <w:rPr>
-          <w:noProof/>
-        </w:rPr>
-        <w:lastRenderedPageBreak/>
-        <w:drawing>
-          <wp:inline distT="0" distB="0" distL="0" distR="0" wp14:anchorId="60BAC326" wp14:editId="5B3452C7">
-            <wp:extent cx="5416262" cy="2802557"/>
-            <wp:effectExtent l="0" t="0" r="0" b="0"/>
-            <wp:docPr id="347661637" name="Imagen 2" descr="Gráfico, Gráfico de dispersión&#10;&#10;El contenido generado por IA puede ser incorrecto."/>
-            <wp:cNvGraphicFramePr>
-              <a:graphicFrameLocks xmlns:a="http://schemas.openxmlformats.org/drawingml/2006/main" noChangeAspect="1"/>
-            </wp:cNvGraphicFramePr>
-            <a:graphic xmlns:a="http://schemas.openxmlformats.org/drawingml/2006/main">
-              <a:graphicData uri="http://schemas.openxmlformats.org/drawingml/2006/picture">
-                <pic:pic xmlns:pic="http://schemas.openxmlformats.org/drawingml/2006/picture">
-                  <pic:nvPicPr>
-                    <pic:cNvPr id="347661637" name="Imagen 2" descr="Gráfico, Gráfico de dispersión&#10;&#10;El contenido generado por IA puede ser incorrecto."/>
+                    <pic:cNvPr id="2075926849" name="Imagen 6" descr="Gráfico, Gráfico de dispersión&#10;&#10;El contenido generado por IA puede ser incorrecto."/>
                     <pic:cNvPicPr>
                       <a:picLocks noChangeAspect="1" noChangeArrowheads="1"/>
                     </pic:cNvPicPr>
@@ -4380,7 +4308,7 @@
                   <pic:spPr bwMode="auto">
                     <a:xfrm>
                       <a:off x="0" y="0"/>
-                      <a:ext cx="5418918" cy="2803931"/>
+                      <a:ext cx="5361969" cy="2583493"/>
                     </a:xfrm>
                     <a:prstGeom prst="rect">
                       <a:avLst/>
@@ -4395,7 +4323,188 @@
       </w:r>
     </w:p>
     <w:p>
-      <w:r>
+      <w:pPr>
+        <w:jc w:val="both"/>
+      </w:pPr>
+      <w:proofErr w:type="spellStart"/>
+      <w:r>
+        <w:t>Silhouette</w:t>
+      </w:r>
+      <w:proofErr w:type="spellEnd"/>
+      <w:r>
+        <w:t xml:space="preserve"> = 0.484</w:t>
+      </w:r>
+    </w:p>
+    <w:p>
+      <w:pPr>
+        <w:jc w:val="both"/>
+        <w:rPr>
+          <w:i/>
+          <w:iCs/>
+          <w:u w:val="single"/>
+        </w:rPr>
+      </w:pPr>
+      <w:r>
+        <w:rPr>
+          <w:noProof/>
+        </w:rPr>
+        <w:drawing>
+          <wp:inline distT="0" distB="0" distL="0" distR="0" wp14:anchorId="137447AC" wp14:editId="11B8E399">
+            <wp:extent cx="5851586" cy="2819400"/>
+            <wp:effectExtent l="0" t="0" r="0" b="0"/>
+            <wp:docPr id="1649558498" name="Imagen 8"/>
+            <wp:cNvGraphicFramePr>
+              <a:graphicFrameLocks xmlns:a="http://schemas.openxmlformats.org/drawingml/2006/main" noChangeAspect="1"/>
+            </wp:cNvGraphicFramePr>
+            <a:graphic xmlns:a="http://schemas.openxmlformats.org/drawingml/2006/main">
+              <a:graphicData uri="http://schemas.openxmlformats.org/drawingml/2006/picture">
+                <pic:pic xmlns:pic="http://schemas.openxmlformats.org/drawingml/2006/picture">
+                  <pic:nvPicPr>
+                    <pic:cNvPr id="0" name="Picture 7"/>
+                    <pic:cNvPicPr>
+                      <a:picLocks noChangeAspect="1" noChangeArrowheads="1"/>
+                    </pic:cNvPicPr>
+                  </pic:nvPicPr>
+                  <pic:blipFill>
+                    <a:blip r:embed="rId28">
+                      <a:extLst>
+                        <a:ext uri="{28A0092B-C50C-407E-A947-70E740481C1C}">
+                          <a14:useLocalDpi xmlns:a14="http://schemas.microsoft.com/office/drawing/2010/main" val="0"/>
+                        </a:ext>
+                      </a:extLst>
+                    </a:blip>
+                    <a:srcRect/>
+                    <a:stretch>
+                      <a:fillRect/>
+                    </a:stretch>
+                  </pic:blipFill>
+                  <pic:spPr bwMode="auto">
+                    <a:xfrm>
+                      <a:off x="0" y="0"/>
+                      <a:ext cx="5860169" cy="2823535"/>
+                    </a:xfrm>
+                    <a:prstGeom prst="rect">
+                      <a:avLst/>
+                    </a:prstGeom>
+                    <a:noFill/>
+                  </pic:spPr>
+                </pic:pic>
+              </a:graphicData>
+            </a:graphic>
+          </wp:inline>
+        </w:drawing>
+      </w:r>
+    </w:p>
+    <w:p>
+      <w:pPr>
+        <w:rPr>
+          <w:i/>
+          <w:iCs/>
+          <w:u w:val="single"/>
+        </w:rPr>
+      </w:pPr>
+      <w:r>
+        <w:rPr>
+          <w:i/>
+          <w:iCs/>
+          <w:u w:val="single"/>
+        </w:rPr>
+        <w:br w:type="page"/>
+      </w:r>
+    </w:p>
+    <w:p>
+      <w:pPr>
+        <w:rPr>
+          <w:i/>
+          <w:iCs/>
+          <w:u w:val="single"/>
+        </w:rPr>
+      </w:pPr>
+      <w:r>
+        <w:rPr>
+          <w:i/>
+          <w:iCs/>
+          <w:u w:val="single"/>
+        </w:rPr>
+        <w:lastRenderedPageBreak/>
+        <w:t>Resultado</w:t>
+      </w:r>
+      <w:r>
+        <w:rPr>
+          <w:i/>
+          <w:iCs/>
+          <w:u w:val="single"/>
+        </w:rPr>
+        <w:t xml:space="preserve"> de cada investigador</w:t>
+      </w:r>
+    </w:p>
+    <w:p>
+      <w:pPr>
+        <w:jc w:val="center"/>
+      </w:pPr>
+      <w:r>
+        <w:drawing>
+          <wp:inline distT="0" distB="0" distL="0" distR="0" wp14:anchorId="441E967F" wp14:editId="59BD9953">
+            <wp:extent cx="5172075" cy="5999218"/>
+            <wp:effectExtent l="0" t="0" r="0" b="1905"/>
+            <wp:docPr id="1467414475" name="Imagen 1" descr="Tabla&#10;&#10;El contenido generado por IA puede ser incorrecto."/>
+            <wp:cNvGraphicFramePr>
+              <a:graphicFrameLocks xmlns:a="http://schemas.openxmlformats.org/drawingml/2006/main" noChangeAspect="1"/>
+            </wp:cNvGraphicFramePr>
+            <a:graphic xmlns:a="http://schemas.openxmlformats.org/drawingml/2006/main">
+              <a:graphicData uri="http://schemas.openxmlformats.org/drawingml/2006/picture">
+                <pic:pic xmlns:pic="http://schemas.openxmlformats.org/drawingml/2006/picture">
+                  <pic:nvPicPr>
+                    <pic:cNvPr id="1467414475" name="Imagen 1" descr="Tabla&#10;&#10;El contenido generado por IA puede ser incorrecto."/>
+                    <pic:cNvPicPr/>
+                  </pic:nvPicPr>
+                  <pic:blipFill>
+                    <a:blip r:embed="rId29"/>
+                    <a:stretch>
+                      <a:fillRect/>
+                    </a:stretch>
+                  </pic:blipFill>
+                  <pic:spPr>
+                    <a:xfrm>
+                      <a:off x="0" y="0"/>
+                      <a:ext cx="5176217" cy="6004022"/>
+                    </a:xfrm>
+                    <a:prstGeom prst="rect">
+                      <a:avLst/>
+                    </a:prstGeom>
+                  </pic:spPr>
+                </pic:pic>
+              </a:graphicData>
+            </a:graphic>
+          </wp:inline>
+        </w:drawing>
+      </w:r>
+    </w:p>
+    <w:p>
+      <w:pPr>
+        <w:jc w:val="center"/>
+        <w:rPr>
+          <w:i/>
+          <w:iCs/>
+          <w:u w:val="single"/>
+        </w:rPr>
+      </w:pPr>
+    </w:p>
+    <w:p>
+      <w:pPr>
+        <w:jc w:val="center"/>
+        <w:rPr>
+          <w:i/>
+          <w:iCs/>
+          <w:u w:val="single"/>
+        </w:rPr>
+      </w:pPr>
+      <w:r>
+        <w:rPr>
+          <w:i/>
+          <w:iCs/>
+          <w:u w:val="single"/>
+        </w:rPr>
         <w:br w:type="page"/>
       </w:r>
     </w:p>
@@ -4433,37 +4542,153 @@
         </w:rPr>
         <w:t xml:space="preserve"> </w:t>
       </w:r>
-      <w:r>
-        <w:rPr>
-          <w:i/>
-          <w:iCs/>
-          <w:u w:val="single"/>
-        </w:rPr>
-        <w:t>Manhattan</w:t>
-      </w:r>
-      <w:r>
-        <w:rPr>
-          <w:i/>
-          <w:iCs/>
-          <w:u w:val="single"/>
-        </w:rPr>
-        <w:t xml:space="preserve"> + Jerárquico</w:t>
-      </w:r>
-    </w:p>
-    <w:p>
-      <w:pPr>
-        <w:rPr>
-          <w:i/>
-          <w:iCs/>
-          <w:u w:val="single"/>
-        </w:rPr>
-      </w:pPr>
-      <w:r>
-        <w:rPr>
-          <w:i/>
-          <w:iCs/>
-          <w:u w:val="single"/>
-        </w:rPr>
+      <w:proofErr w:type="spellStart"/>
+      <w:r>
+        <w:rPr>
+          <w:i/>
+          <w:iCs/>
+          <w:u w:val="single"/>
+        </w:rPr>
+        <w:t>Euclidean</w:t>
+      </w:r>
+      <w:proofErr w:type="spellEnd"/>
+      <w:r>
+        <w:rPr>
+          <w:i/>
+          <w:iCs/>
+          <w:u w:val="single"/>
+        </w:rPr>
+        <w:t>+ Jerárquico</w:t>
+      </w:r>
+    </w:p>
+    <w:p>
+      <w:pPr>
+        <w:jc w:val="center"/>
+      </w:pPr>
+      <w:r>
+        <w:rPr>
+          <w:noProof/>
+        </w:rPr>
+        <w:drawing>
+          <wp:inline distT="0" distB="0" distL="0" distR="0" wp14:anchorId="6C802B54" wp14:editId="1643E2AB">
+            <wp:extent cx="5848350" cy="2211761"/>
+            <wp:effectExtent l="0" t="0" r="0" b="0"/>
+            <wp:docPr id="1807744364" name="Imagen 9"/>
+            <wp:cNvGraphicFramePr>
+              <a:graphicFrameLocks xmlns:a="http://schemas.openxmlformats.org/drawingml/2006/main" noChangeAspect="1"/>
+            </wp:cNvGraphicFramePr>
+            <a:graphic xmlns:a="http://schemas.openxmlformats.org/drawingml/2006/main">
+              <a:graphicData uri="http://schemas.openxmlformats.org/drawingml/2006/picture">
+                <pic:pic xmlns:pic="http://schemas.openxmlformats.org/drawingml/2006/picture">
+                  <pic:nvPicPr>
+                    <pic:cNvPr id="0" name="Picture 8"/>
+                    <pic:cNvPicPr>
+                      <a:picLocks noChangeAspect="1" noChangeArrowheads="1"/>
+                    </pic:cNvPicPr>
+                  </pic:nvPicPr>
+                  <pic:blipFill>
+                    <a:blip r:embed="rId30">
+                      <a:extLst>
+                        <a:ext uri="{28A0092B-C50C-407E-A947-70E740481C1C}">
+                          <a14:useLocalDpi xmlns:a14="http://schemas.microsoft.com/office/drawing/2010/main" val="0"/>
+                        </a:ext>
+                      </a:extLst>
+                    </a:blip>
+                    <a:srcRect/>
+                    <a:stretch>
+                      <a:fillRect/>
+                    </a:stretch>
+                  </pic:blipFill>
+                  <pic:spPr bwMode="auto">
+                    <a:xfrm>
+                      <a:off x="0" y="0"/>
+                      <a:ext cx="5860220" cy="2216250"/>
+                    </a:xfrm>
+                    <a:prstGeom prst="rect">
+                      <a:avLst/>
+                    </a:prstGeom>
+                    <a:noFill/>
+                  </pic:spPr>
+                </pic:pic>
+              </a:graphicData>
+            </a:graphic>
+          </wp:inline>
+        </w:drawing>
+      </w:r>
+    </w:p>
+    <w:p>
+      <w:pPr>
+        <w:jc w:val="both"/>
+      </w:pPr>
+      <w:proofErr w:type="spellStart"/>
+      <w:r>
+        <w:t>Silhouette</w:t>
+      </w:r>
+      <w:proofErr w:type="spellEnd"/>
+      <w:r>
+        <w:t xml:space="preserve"> = </w:t>
+      </w:r>
+      <w:r>
+        <w:t>0.532</w:t>
+      </w:r>
+    </w:p>
+    <w:p>
+      <w:pPr>
+        <w:jc w:val="center"/>
+      </w:pPr>
+      <w:r>
+        <w:rPr>
+          <w:noProof/>
+        </w:rPr>
+        <w:drawing>
+          <wp:inline distT="0" distB="0" distL="0" distR="0" wp14:anchorId="6E28546E" wp14:editId="28AE7444">
+            <wp:extent cx="5581650" cy="2110899"/>
+            <wp:effectExtent l="0" t="0" r="0" b="3810"/>
+            <wp:docPr id="293238898" name="Imagen 10"/>
+            <wp:cNvGraphicFramePr>
+              <a:graphicFrameLocks xmlns:a="http://schemas.openxmlformats.org/drawingml/2006/main" noChangeAspect="1"/>
+            </wp:cNvGraphicFramePr>
+            <a:graphic xmlns:a="http://schemas.openxmlformats.org/drawingml/2006/main">
+              <a:graphicData uri="http://schemas.openxmlformats.org/drawingml/2006/picture">
+                <pic:pic xmlns:pic="http://schemas.openxmlformats.org/drawingml/2006/picture">
+                  <pic:nvPicPr>
+                    <pic:cNvPr id="0" name="Picture 9"/>
+                    <pic:cNvPicPr>
+                      <a:picLocks noChangeAspect="1" noChangeArrowheads="1"/>
+                    </pic:cNvPicPr>
+                  </pic:nvPicPr>
+                  <pic:blipFill>
+                    <a:blip r:embed="rId31">
+                      <a:extLst>
+                        <a:ext uri="{28A0092B-C50C-407E-A947-70E740481C1C}">
+                          <a14:useLocalDpi xmlns:a14="http://schemas.microsoft.com/office/drawing/2010/main" val="0"/>
+                        </a:ext>
+                      </a:extLst>
+                    </a:blip>
+                    <a:srcRect/>
+                    <a:stretch>
+                      <a:fillRect/>
+                    </a:stretch>
+                  </pic:blipFill>
+                  <pic:spPr bwMode="auto">
+                    <a:xfrm>
+                      <a:off x="0" y="0"/>
+                      <a:ext cx="5605066" cy="2119755"/>
+                    </a:xfrm>
+                    <a:prstGeom prst="rect">
+                      <a:avLst/>
+                    </a:prstGeom>
+                    <a:noFill/>
+                  </pic:spPr>
+                </pic:pic>
+              </a:graphicData>
+            </a:graphic>
+          </wp:inline>
+        </w:drawing>
+      </w:r>
+    </w:p>
+    <w:p>
+      <w:r>
         <w:br w:type="page"/>
       </w:r>
     </w:p>
@@ -4482,42 +4707,57 @@
           <w:u w:val="single"/>
         </w:rPr>
         <w:lastRenderedPageBreak/>
-        <w:t xml:space="preserve">UMAP </w:t>
-      </w:r>
-      <w:r>
-        <w:rPr>
-          <w:i/>
-          <w:iCs/>
-          <w:u w:val="single"/>
-          <w:lang w:val="en-GB"/>
-        </w:rPr>
-        <w:sym w:font="Wingdings" w:char="F0E0"/>
-      </w:r>
-      <w:r>
-        <w:rPr>
-          <w:i/>
-          <w:iCs/>
-          <w:u w:val="single"/>
-        </w:rPr>
-        <w:t xml:space="preserve"> </w:t>
-      </w:r>
-      <w:proofErr w:type="spellStart"/>
-      <w:r>
-        <w:rPr>
-          <w:i/>
-          <w:iCs/>
-          <w:u w:val="single"/>
-        </w:rPr>
-        <w:t>Correlation</w:t>
-      </w:r>
-      <w:proofErr w:type="spellEnd"/>
-      <w:r>
-        <w:rPr>
-          <w:i/>
-          <w:iCs/>
-          <w:u w:val="single"/>
-        </w:rPr>
-        <w:t>+ Jerárquico</w:t>
+        <w:t>Resultado</w:t>
+      </w:r>
+      <w:r>
+        <w:rPr>
+          <w:i/>
+          <w:iCs/>
+          <w:u w:val="single"/>
+        </w:rPr>
+        <w:t xml:space="preserve"> de cada investigador</w:t>
+      </w:r>
+    </w:p>
+    <w:p>
+      <w:pPr>
+        <w:jc w:val="center"/>
+      </w:pPr>
+      <w:r>
+        <w:drawing>
+          <wp:inline distT="0" distB="0" distL="0" distR="0" wp14:anchorId="0623A986" wp14:editId="279FEB07">
+            <wp:extent cx="5114925" cy="5810227"/>
+            <wp:effectExtent l="0" t="0" r="0" b="635"/>
+            <wp:docPr id="131945232" name="Imagen 1" descr="Tabla&#10;&#10;El contenido generado por IA puede ser incorrecto."/>
+            <wp:cNvGraphicFramePr>
+              <a:graphicFrameLocks xmlns:a="http://schemas.openxmlformats.org/drawingml/2006/main" noChangeAspect="1"/>
+            </wp:cNvGraphicFramePr>
+            <a:graphic xmlns:a="http://schemas.openxmlformats.org/drawingml/2006/main">
+              <a:graphicData uri="http://schemas.openxmlformats.org/drawingml/2006/picture">
+                <pic:pic xmlns:pic="http://schemas.openxmlformats.org/drawingml/2006/picture">
+                  <pic:nvPicPr>
+                    <pic:cNvPr id="131945232" name="Imagen 1" descr="Tabla&#10;&#10;El contenido generado por IA puede ser incorrecto."/>
+                    <pic:cNvPicPr/>
+                  </pic:nvPicPr>
+                  <pic:blipFill>
+                    <a:blip r:embed="rId32"/>
+                    <a:stretch>
+                      <a:fillRect/>
+                    </a:stretch>
+                  </pic:blipFill>
+                  <pic:spPr>
+                    <a:xfrm>
+                      <a:off x="0" y="0"/>
+                      <a:ext cx="5118123" cy="5813859"/>
+                    </a:xfrm>
+                    <a:prstGeom prst="rect">
+                      <a:avLst/>
+                    </a:prstGeom>
+                  </pic:spPr>
+                </pic:pic>
+              </a:graphicData>
+            </a:graphic>
+          </wp:inline>
+        </w:drawing>
       </w:r>
     </w:p>
     <w:p/>
@@ -4931,7 +5171,7 @@
   <w:style w:type="paragraph" w:default="1" w:styleId="Normal">
     <w:name w:val="Normal"/>
     <w:qFormat/>
-    <w:rsid w:val="004F421C"/>
+    <w:rsid w:val="00A67E38"/>
   </w:style>
   <w:style w:type="paragraph" w:styleId="Ttulo1">
     <w:name w:val="heading 1"/>
@@ -5448,6 +5688,36 @@
       <w:spacing w:val="5"/>
     </w:rPr>
   </w:style>
+  <w:style w:type="paragraph" w:styleId="HTMLconformatoprevio">
+    <w:name w:val="HTML Preformatted"/>
+    <w:basedOn w:val="Normal"/>
+    <w:link w:val="HTMLconformatoprevioCar"/>
+    <w:uiPriority w:val="99"/>
+    <w:semiHidden/>
+    <w:unhideWhenUsed/>
+    <w:rsid w:val="006B66A7"/>
+    <w:pPr>
+      <w:spacing w:after="0" w:line="240" w:lineRule="auto"/>
+    </w:pPr>
+    <w:rPr>
+      <w:rFonts w:ascii="Consolas" w:hAnsi="Consolas"/>
+      <w:sz w:val="20"/>
+      <w:szCs w:val="20"/>
+    </w:rPr>
+  </w:style>
+  <w:style w:type="character" w:customStyle="1" w:styleId="HTMLconformatoprevioCar">
+    <w:name w:val="HTML con formato previo Car"/>
+    <w:basedOn w:val="Fuentedeprrafopredeter"/>
+    <w:link w:val="HTMLconformatoprevio"/>
+    <w:uiPriority w:val="99"/>
+    <w:semiHidden/>
+    <w:rsid w:val="006B66A7"/>
+    <w:rPr>
+      <w:rFonts w:ascii="Consolas" w:hAnsi="Consolas"/>
+      <w:sz w:val="20"/>
+      <w:szCs w:val="20"/>
+    </w:rPr>
+  </w:style>
 </w:styles>
 </file>
 

</xml_diff>